<commit_message>
release: align responsible AI courseware v13
</commit_message>
<xml_diff>
--- a/courseware/LG-Responsible Generative AI Basics.docx
+++ b/courseware/LG-Responsible Generative AI Basics.docx
@@ -179,7 +179,7 @@
           <w:color w:val="1F6FEB"/>
           <w:sz w:val="24"/>
         </w:rPr>
-        <w:t>Version 3.1</w:t>
+        <w:t>Version 3.2</w:t>
       </w:r>
     </w:p>
     <w:p>
@@ -515,14 +515,68 @@
           </w:p>
         </w:tc>
       </w:tr>
+      <w:tr>
+        <w:tc>
+          <w:tcPr>
+            <w:tcW w:type="dxa" w:w="2160"/>
+          </w:tcPr>
+          <w:p>
+            <w:r/>
+            <w:r>
+              <w:rPr>
+                <w:sz w:val="19"/>
+              </w:rPr>
+              <w:t>3.2</w:t>
+            </w:r>
+          </w:p>
+        </w:tc>
+        <w:tc>
+          <w:tcPr>
+            <w:tcW w:type="dxa" w:w="2160"/>
+          </w:tcPr>
+          <w:p>
+            <w:r/>
+            <w:r>
+              <w:rPr>
+                <w:sz w:val="19"/>
+              </w:rPr>
+              <w:t>9 September 2026</w:t>
+            </w:r>
+          </w:p>
+        </w:tc>
+        <w:tc>
+          <w:tcPr>
+            <w:tcW w:type="dxa" w:w="2160"/>
+          </w:tcPr>
+          <w:p>
+            <w:r/>
+            <w:r>
+              <w:rPr>
+                <w:sz w:val="19"/>
+              </w:rPr>
+              <w:t>Alignment release: corrected every activity hyperlink to the deployed /labs/ path; added a Facilitator Guide and Assessment Plan generated from the same course, slide, activity and assessment mappings; added clickable activity and practice-exam links, plus original responsible-AI learning visuals.</w:t>
+            </w:r>
+          </w:p>
+        </w:tc>
+        <w:tc>
+          <w:tcPr>
+            <w:tcW w:type="dxa" w:w="2160"/>
+          </w:tcPr>
+          <w:p>
+            <w:r/>
+            <w:r>
+              <w:rPr>
+                <w:sz w:val="19"/>
+              </w:rPr>
+              <w:t>Tertiary Infotech Academy Pte Ltd</w:t>
+            </w:r>
+          </w:p>
+        </w:tc>
+      </w:tr>
     </w:tbl>
     <w:p>
-      <w:r>
-        <w:br w:type="page"/>
-      </w:r>
-    </w:p>
-    <w:p>
-      <w:pPr>
+      <w:pPr>
+        <w:pageBreakBefore/>
         <w:spacing w:after="120"/>
       </w:pPr>
       <w:r>
@@ -1057,7 +1111,7 @@
           <w:b/>
           <w:color w:val="1F6FEB"/>
         </w:rPr>
-        <w:t>https://tertiarycourses.github.io/TGS-2025060472-Responsible-Generative-AI-Basics/</w:t>
+        <w:t>https://tertiarycourses.github.io/TGS-2025060472-Responsible-Generative-AI-Basics/labs/</w:t>
       </w:r>
     </w:p>
     <w:p>
@@ -1769,7 +1823,7 @@
         <w:rPr>
           <w:sz w:val="20"/>
         </w:rPr>
-        <w:t>https://tertiarycourses.github.io/TGS-2025060472-Responsible-Generative-AI-Basics/lu1-ethical-principles/ethical-dilemma/</w:t>
+        <w:t>https://tertiarycourses.github.io/TGS-2025060472-Responsible-Generative-AI-Basics/labs/lu1-ethical-principles/ethical-dilemma/</w:t>
       </w:r>
     </w:p>
     <w:p>
@@ -1964,6 +2018,9 @@
         <w:gridCol w:w="8640"/>
       </w:tblGrid>
       <w:tr>
+        <w:trPr>
+          <w:cantSplit/>
+        </w:trPr>
         <w:tc>
           <w:tcPr>
             <w:tcW w:type="dxa" w:w="8640"/>
@@ -2017,7 +2074,7 @@
         <w:rPr>
           <w:sz w:val="20"/>
         </w:rPr>
-        <w:t>https://tertiarycourses.github.io/TGS-2025060472-Responsible-Generative-AI-Basics/lu1-ethical-principles/principles-quiz/</w:t>
+        <w:t>https://tertiarycourses.github.io/TGS-2025060472-Responsible-Generative-AI-Basics/labs/lu1-ethical-principles/principles-quiz/</w:t>
       </w:r>
     </w:p>
     <w:p>
@@ -2212,6 +2269,9 @@
         <w:gridCol w:w="8640"/>
       </w:tblGrid>
       <w:tr>
+        <w:trPr>
+          <w:cantSplit/>
+        </w:trPr>
         <w:tc>
           <w:tcPr>
             <w:tcW w:type="dxa" w:w="8640"/>
@@ -2265,7 +2325,7 @@
         <w:rPr>
           <w:sz w:val="20"/>
         </w:rPr>
-        <w:t>https://tertiarycourses.github.io/TGS-2025060472-Responsible-Generative-AI-Basics/lu1-ethical-principles/prompt-injection/</w:t>
+        <w:t>https://tertiarycourses.github.io/TGS-2025060472-Responsible-Generative-AI-Basics/labs/lu1-ethical-principles/prompt-injection/</w:t>
       </w:r>
     </w:p>
     <w:p>
@@ -2460,6 +2520,9 @@
         <w:gridCol w:w="8640"/>
       </w:tblGrid>
       <w:tr>
+        <w:trPr>
+          <w:cantSplit/>
+        </w:trPr>
         <w:tc>
           <w:tcPr>
             <w:tcW w:type="dxa" w:w="8640"/>
@@ -2513,7 +2576,7 @@
         <w:rPr>
           <w:sz w:val="20"/>
         </w:rPr>
-        <w:t>https://tertiarycourses.github.io/TGS-2025060472-Responsible-Generative-AI-Basics/lu1-ethical-principles/decision-framework/</w:t>
+        <w:t>https://tertiarycourses.github.io/TGS-2025060472-Responsible-Generative-AI-Basics/labs/lu1-ethical-principles/decision-framework/</w:t>
       </w:r>
     </w:p>
     <w:p>
@@ -2708,6 +2771,9 @@
         <w:gridCol w:w="8640"/>
       </w:tblGrid>
       <w:tr>
+        <w:trPr>
+          <w:cantSplit/>
+        </w:trPr>
         <w:tc>
           <w:tcPr>
             <w:tcW w:type="dxa" w:w="8640"/>
@@ -2761,7 +2827,7 @@
         <w:rPr>
           <w:sz w:val="20"/>
         </w:rPr>
-        <w:t>https://tertiarycourses.github.io/TGS-2025060472-Responsible-Generative-AI-Basics/lu1-ethical-principles/skepticism-checker/</w:t>
+        <w:t>https://tertiarycourses.github.io/TGS-2025060472-Responsible-Generative-AI-Basics/labs/lu1-ethical-principles/skepticism-checker/</w:t>
       </w:r>
     </w:p>
     <w:p>
@@ -2956,6 +3022,9 @@
         <w:gridCol w:w="8640"/>
       </w:tblGrid>
       <w:tr>
+        <w:trPr>
+          <w:cantSplit/>
+        </w:trPr>
         <w:tc>
           <w:tcPr>
             <w:tcW w:type="dxa" w:w="8640"/>
@@ -3009,7 +3078,7 @@
         <w:rPr>
           <w:sz w:val="20"/>
         </w:rPr>
-        <w:t>https://tertiarycourses.github.io/TGS-2025060472-Responsible-Generative-AI-Basics/lu1-ethical-principles/cognitive-threat-matrix/</w:t>
+        <w:t>https://tertiarycourses.github.io/TGS-2025060472-Responsible-Generative-AI-Basics/labs/lu1-ethical-principles/cognitive-threat-matrix/</w:t>
       </w:r>
     </w:p>
     <w:p>
@@ -3219,6 +3288,9 @@
         <w:gridCol w:w="8640"/>
       </w:tblGrid>
       <w:tr>
+        <w:trPr>
+          <w:cantSplit/>
+        </w:trPr>
         <w:tc>
           <w:tcPr>
             <w:tcW w:type="dxa" w:w="8640"/>
@@ -3343,7 +3415,7 @@
         <w:rPr>
           <w:sz w:val="20"/>
         </w:rPr>
-        <w:t>https://tertiarycourses.github.io/TGS-2025060472-Responsible-Generative-AI-Basics/lu2-privacy/dataprivacy/</w:t>
+        <w:t>https://tertiarycourses.github.io/TGS-2025060472-Responsible-Generative-AI-Basics/labs/lu2-privacy/dataprivacy/</w:t>
       </w:r>
     </w:p>
     <w:p>
@@ -3553,6 +3625,9 @@
         <w:gridCol w:w="8640"/>
       </w:tblGrid>
       <w:tr>
+        <w:trPr>
+          <w:cantSplit/>
+        </w:trPr>
         <w:tc>
           <w:tcPr>
             <w:tcW w:type="dxa" w:w="8640"/>
@@ -3606,7 +3681,7 @@
         <w:rPr>
           <w:sz w:val="20"/>
         </w:rPr>
-        <w:t>https://tertiarycourses.github.io/TGS-2025060472-Responsible-Generative-AI-Basics/lu2-privacy/anonymizer-python/</w:t>
+        <w:t>https://tertiarycourses.github.io/TGS-2025060472-Responsible-Generative-AI-Basics/labs/lu2-privacy/anonymizer-python/</w:t>
       </w:r>
     </w:p>
     <w:p>
@@ -3801,6 +3876,9 @@
         <w:gridCol w:w="8640"/>
       </w:tblGrid>
       <w:tr>
+        <w:trPr>
+          <w:cantSplit/>
+        </w:trPr>
         <w:tc>
           <w:tcPr>
             <w:tcW w:type="dxa" w:w="8640"/>
@@ -3854,7 +3932,7 @@
         <w:rPr>
           <w:sz w:val="20"/>
         </w:rPr>
-        <w:t>https://tertiarycourses.github.io/TGS-2025060472-Responsible-Generative-AI-Basics/lu2-privacy/privacy-policy/</w:t>
+        <w:t>https://tertiarycourses.github.io/TGS-2025060472-Responsible-Generative-AI-Basics/labs/lu2-privacy/privacy-policy/</w:t>
       </w:r>
     </w:p>
     <w:p>
@@ -4049,6 +4127,9 @@
         <w:gridCol w:w="8640"/>
       </w:tblGrid>
       <w:tr>
+        <w:trPr>
+          <w:cantSplit/>
+        </w:trPr>
         <w:tc>
           <w:tcPr>
             <w:tcW w:type="dxa" w:w="8640"/>
@@ -4173,7 +4254,7 @@
         <w:rPr>
           <w:sz w:val="20"/>
         </w:rPr>
-        <w:t>https://tertiarycourses.github.io/TGS-2025060472-Responsible-Generative-AI-Basics/lu3-best-practices/ai-comparison/</w:t>
+        <w:t>https://tertiarycourses.github.io/TGS-2025060472-Responsible-Generative-AI-Basics/labs/lu3-best-practices/ai-comparison/</w:t>
       </w:r>
     </w:p>
     <w:p>
@@ -4368,6 +4449,9 @@
         <w:gridCol w:w="8640"/>
       </w:tblGrid>
       <w:tr>
+        <w:trPr>
+          <w:cantSplit/>
+        </w:trPr>
         <w:tc>
           <w:tcPr>
             <w:tcW w:type="dxa" w:w="8640"/>
@@ -4421,7 +4505,7 @@
         <w:rPr>
           <w:sz w:val="20"/>
         </w:rPr>
-        <w:t>https://tertiarycourses.github.io/TGS-2025060472-Responsible-Generative-AI-Basics/lu3-best-practices/differential-privacy/</w:t>
+        <w:t>https://tertiarycourses.github.io/TGS-2025060472-Responsible-Generative-AI-Basics/labs/lu3-best-practices/differential-privacy/</w:t>
       </w:r>
     </w:p>
     <w:p>
@@ -4616,6 +4700,9 @@
         <w:gridCol w:w="8640"/>
       </w:tblGrid>
       <w:tr>
+        <w:trPr>
+          <w:cantSplit/>
+        </w:trPr>
         <w:tc>
           <w:tcPr>
             <w:tcW w:type="dxa" w:w="8640"/>
@@ -4669,7 +4756,7 @@
         <w:rPr>
           <w:sz w:val="20"/>
         </w:rPr>
-        <w:t>https://tertiarycourses.github.io/TGS-2025060472-Responsible-Generative-AI-Basics/lu3-best-practices/xai-explorer/</w:t>
+        <w:t>https://tertiarycourses.github.io/TGS-2025060472-Responsible-Generative-AI-Basics/labs/lu3-best-practices/xai-explorer/</w:t>
       </w:r>
     </w:p>
     <w:p>
@@ -4864,6 +4951,9 @@
         <w:gridCol w:w="8640"/>
       </w:tblGrid>
       <w:tr>
+        <w:trPr>
+          <w:cantSplit/>
+        </w:trPr>
         <w:tc>
           <w:tcPr>
             <w:tcW w:type="dxa" w:w="8640"/>
@@ -4917,7 +5007,7 @@
         <w:rPr>
           <w:sz w:val="20"/>
         </w:rPr>
-        <w:t>https://tertiarycourses.github.io/TGS-2025060472-Responsible-Generative-AI-Basics/lu3-best-practices/ai-resource-allocation/</w:t>
+        <w:t>https://tertiarycourses.github.io/TGS-2025060472-Responsible-Generative-AI-Basics/labs/lu3-best-practices/ai-resource-allocation/</w:t>
       </w:r>
     </w:p>
     <w:p>
@@ -5127,6 +5217,9 @@
         <w:gridCol w:w="8640"/>
       </w:tblGrid>
       <w:tr>
+        <w:trPr>
+          <w:cantSplit/>
+        </w:trPr>
         <w:tc>
           <w:tcPr>
             <w:tcW w:type="dxa" w:w="8640"/>
@@ -5180,7 +5273,7 @@
         <w:rPr>
           <w:sz w:val="20"/>
         </w:rPr>
-        <w:t>https://tertiarycourses.github.io/TGS-2025060472-Responsible-Generative-AI-Basics/lu3-best-practices/ethics-case-study/</w:t>
+        <w:t>https://tertiarycourses.github.io/TGS-2025060472-Responsible-Generative-AI-Basics/labs/lu3-best-practices/ethics-case-study/</w:t>
       </w:r>
     </w:p>
     <w:p>
@@ -5390,6 +5483,9 @@
         <w:gridCol w:w="8640"/>
       </w:tblGrid>
       <w:tr>
+        <w:trPr>
+          <w:cantSplit/>
+        </w:trPr>
         <w:tc>
           <w:tcPr>
             <w:tcW w:type="dxa" w:w="8640"/>

</xml_diff>